<commit_message>
Add English Wiktionary (518,943 headwords) to the cross-linguistic comparison
Co-Authored-By: Claude Opus 5.5 <noreply@anthropic.com>
</commit_message>
<xml_diff>
--- a/paper/HiddenCore_ConsILR2026.docx
+++ b/paper/HiddenCore_ConsILR2026.docx
@@ -1566,7 +1566,7 @@
     <w:p>
       <w:pPr/>
       <w:r>
-        <w:t>Figure 3 and Table 2 show that the DEX is an outlier. The relative size of the Kernel depends on the size of the dictionary, because large dictionaries contain many rare words that define nothing, whereas the share of the Kernel occupied by the MinSet does not. This share lies between 10% and 16% in the dictionaries of all other languages, Romance languages included, and reaches 28–29% in the DEX. Reciprocally defined pairs are five to twenty times more frequent in the DEX than in the other dictionaries. The Romanian Wiktionary has values close to those of the DEX, but it is not independent evidence: 70% of its first definitions are near-copies of DEX definitions. The large core is therefore a property of the defining practice of the DEX, not of Romance languages.</w:t>
+        <w:t>Figure 3 and Table 2 show that the DEX is an outlier. The relative size of the Kernel depends on the size of the dictionary, because large dictionaries contain many rare words that define nothing, whereas the share of the Kernel occupied by the MinSet does not. This share lies between 10% and 17% in the dictionaries of all other languages, Romance languages included, and reaches 28–29% in the DEX. Reciprocally defined pairs are five to twenty times more frequent in the DEX than in the other dictionaries. The Romanian Wiktionary has values close to those of the DEX, but it is not independent evidence: 70% of its first definitions are near-copies of DEX definitions. The large core is therefore a property of the defining practice of the DEX, not of Romance languages.</w:t>
       </w:r>
     </w:p>
     <w:p>
@@ -1576,7 +1576,7 @@
       <w:r>
         <w:drawing>
           <wp:inline xmlns:a="http://schemas.openxmlformats.org/drawingml/2006/main" xmlns:pic="http://schemas.openxmlformats.org/drawingml/2006/picture">
-            <wp:extent cx="5184000" cy="3067028"/>
+            <wp:extent cx="5184000" cy="3247745"/>
             <wp:docPr id="3" name="Picture 3"/>
             <wp:cNvGraphicFramePr>
               <a:graphicFrameLocks noChangeAspect="1"/>
@@ -1597,7 +1597,7 @@
                   <pic:spPr>
                     <a:xfrm>
                       <a:off x="0" y="0"/>
-                      <a:ext cx="5184000" cy="3067028"/>
+                      <a:ext cx="5184000" cy="3247745"/>
                     </a:xfrm>
                     <a:prstGeom prst="rect"/>
                   </pic:spPr>
@@ -2571,6 +2571,130 @@
                 <w:sz w:val="18"/>
               </w:rPr>
               <w:t>10</w:t>
+            </w:r>
+          </w:p>
+        </w:tc>
+      </w:tr>
+      <w:tr>
+        <w:trPr>
+          <w:cantSplit/>
+        </w:trPr>
+        <w:tc>
+          <w:tcPr>
+            <w:tcW w:type="dxa" w:w="1180"/>
+          </w:tcPr>
+          <w:p>
+            <w:pPr>
+              <w:pStyle w:val="TableText"/>
+              <w:jc w:val="left"/>
+            </w:pPr>
+            <w:r>
+              <w:rPr>
+                <w:sz w:val="18"/>
+              </w:rPr>
+              <w:t>English</w:t>
+            </w:r>
+          </w:p>
+        </w:tc>
+        <w:tc>
+          <w:tcPr>
+            <w:tcW w:type="dxa" w:w="1603"/>
+          </w:tcPr>
+          <w:p>
+            <w:pPr>
+              <w:pStyle w:val="TableText"/>
+              <w:jc w:val="left"/>
+            </w:pPr>
+            <w:r>
+              <w:rPr>
+                <w:sz w:val="18"/>
+              </w:rPr>
+              <w:t>Wiktionary</w:t>
+            </w:r>
+          </w:p>
+        </w:tc>
+        <w:tc>
+          <w:tcPr>
+            <w:tcW w:type="dxa" w:w="1201"/>
+          </w:tcPr>
+          <w:p>
+            <w:pPr>
+              <w:pStyle w:val="TableText"/>
+              <w:jc w:val="right"/>
+            </w:pPr>
+            <w:r>
+              <w:rPr>
+                <w:sz w:val="18"/>
+              </w:rPr>
+              <w:t>518,943</w:t>
+            </w:r>
+          </w:p>
+        </w:tc>
+        <w:tc>
+          <w:tcPr>
+            <w:tcW w:type="dxa" w:w="1254"/>
+          </w:tcPr>
+          <w:p>
+            <w:pPr>
+              <w:pStyle w:val="TableText"/>
+              <w:jc w:val="right"/>
+            </w:pPr>
+            <w:r>
+              <w:rPr>
+                <w:sz w:val="18"/>
+              </w:rPr>
+              <w:t>4.4–6.0%</w:t>
+            </w:r>
+          </w:p>
+        </w:tc>
+        <w:tc>
+          <w:tcPr>
+            <w:tcW w:type="dxa" w:w="1152"/>
+          </w:tcPr>
+          <w:p>
+            <w:pPr>
+              <w:pStyle w:val="TableText"/>
+              <w:jc w:val="right"/>
+            </w:pPr>
+            <w:r>
+              <w:rPr>
+                <w:sz w:val="18"/>
+              </w:rPr>
+              <w:t>0.7–1.1%</w:t>
+            </w:r>
+          </w:p>
+        </w:tc>
+        <w:tc>
+          <w:tcPr>
+            <w:tcW w:type="dxa" w:w="1463"/>
+          </w:tcPr>
+          <w:p>
+            <w:pPr>
+              <w:pStyle w:val="TableText"/>
+              <w:jc w:val="right"/>
+            </w:pPr>
+            <w:r>
+              <w:rPr>
+                <w:sz w:val="18"/>
+              </w:rPr>
+              <w:t>17%</w:t>
+            </w:r>
+          </w:p>
+        </w:tc>
+        <w:tc>
+          <w:tcPr>
+            <w:tcW w:type="dxa" w:w="1196"/>
+          </w:tcPr>
+          <w:p>
+            <w:pPr>
+              <w:pStyle w:val="TableText"/>
+              <w:jc w:val="right"/>
+            </w:pPr>
+            <w:r>
+              <w:rPr>
+                <w:sz w:val="18"/>
+              </w:rPr>
+              <w:t>8</w:t>
             </w:r>
           </w:p>
         </w:tc>

</xml_diff>

<commit_message>
Q1 analyses: human gold standard, graded counterfactuals on 14 dictionaries, statistics; deterministic tie-break
- LLM accuracy vs hand-made Romanian Wiktionary links: 81.3% (deliberate links, 95% CI 80.5-82.1%),
  frequency rule 55.3%; gold-corrected graph leaves results unchanged.
- Synonym tails occur in 12% of DEX definitions vs 0-3% elsewhere; removing them lowers
  MinSet/Kernel from 28.5% to 22.3% (DEX) and leaves other languages unchanged.
- Ties in the most-frequent rule broken alphabetically; graphs rebuilt; main results unchanged
  (MinSet 6,193-6,325).

Co-Authored-By: Claude Opus 5.5 <noreply@anthropic.com>
</commit_message>
<xml_diff>
--- a/paper/HiddenCore_ConsILR2026.docx
+++ b/paper/HiddenCore_ConsILR2026.docx
@@ -1216,7 +1216,7 @@
               <w:rPr>
                 <w:sz w:val="18"/>
               </w:rPr>
-              <w:t>18,576 (29.1%)</w:t>
+              <w:t>18,579 (29.1%)</w:t>
             </w:r>
           </w:p>
         </w:tc>
@@ -1234,7 +1234,7 @@
               <w:rPr>
                 <w:sz w:val="18"/>
               </w:rPr>
-              <w:t>12,644 (19.8%)</w:t>
+              <w:t>12,657 (19.8%)</w:t>
             </w:r>
           </w:p>
         </w:tc>
@@ -1252,7 +1252,7 @@
               <w:rPr>
                 <w:sz w:val="18"/>
               </w:rPr>
-              <w:t>4,770–5,352 (7.5–8.4%)</w:t>
+              <w:t>4,777–5,357 (7.5–8.4%)</w:t>
             </w:r>
           </w:p>
         </w:tc>
@@ -1270,7 +1270,7 @@
               <w:rPr>
                 <w:sz w:val="18"/>
               </w:rPr>
-              <w:t>7,158</w:t>
+              <w:t>7,157</w:t>
             </w:r>
           </w:p>
         </w:tc>
@@ -6543,7 +6543,7 @@
         <w:t>fag</w:t>
       </w:r>
       <w:r>
-        <w:t xml:space="preserve"> ‘beech’. Most of them belong to the vocabulary of traditional rural life, and the DEX defines them without using them in the definitions of other headwords. The words that the DEX uses most often in definitions form a different set. To compare sets of equal size, we take the 1,419 headwords that occur in the largest number of definitions. Only 437 of them belong to Graur’s list, and the two sets differ in origin (Figure 5). With the same etymological classification, Graur’s list is 53% Latin and 20% Slavic, whereas the most frequent defining words are 35% French, 30% Latin and 4% Slavic. Table 5 lists the 30 content words used most often in definitions. Most of them are learned or abstract terms, such as </w:t>
+        <w:t xml:space="preserve"> ‘beech’. Most of them belong to the vocabulary of traditional rural life, and the DEX defines them without using them in the definitions of other headwords. The words that the DEX uses most often in definitions form a different set. To compare sets of equal size, we take the 1,419 headwords that occur in the largest number of definitions. Only 438 of them belong to Graur’s list, and the two sets differ in origin (Figure 5). With the same etymological classification, Graur’s list is 53% Latin and 20% Slavic, whereas the most frequent defining words are 35% French, 30% Latin and 4% Slavic. Table 5 lists the 30 content words used most often in definitions. Most of them are learned or abstract terms, such as </w:t>
       </w:r>
       <w:r>
         <w:rPr>

</xml_diff>